<commit_message>
docs(tableau): adopt Tableau as dashboard tool
</commit_message>
<xml_diff>
--- a/docs/source/TTDLTQ_script.docx
+++ b/docs/source/TTDLTQ_script.docx
@@ -2115,7 +2115,7 @@
           <w:rFonts w:eastAsia="Times New Roman"/>
           <w:sz w:val="23"/>
         </w:rPr>
-        <w:t>Power BI để xây dựng Dashboard, Filter, Drill-down, Tooltip và Cross-filtering.</w:t>
+        <w:t>Tableau để xây dựng Dashboard, Filter, Drill-down, Tooltip và Cross-filtering.</w:t>
       </w:r>
     </w:p>
     <w:p>
@@ -2419,7 +2419,7 @@
                 <w:rFonts w:eastAsia="Times New Roman"/>
                 <w:sz w:val="20"/>
               </w:rPr>
-              <w:t>BI + Model</w:t>
+              <w:t>Dashboard + Model</w:t>
             </w:r>
           </w:p>
         </w:tc>
@@ -2440,7 +2440,7 @@
                 <w:rFonts w:eastAsia="Times New Roman"/>
                 <w:sz w:val="20"/>
               </w:rPr>
-              <w:t>Logistic Regression, Power BI, interaction, demo</w:t>
+              <w:t>Logistic Regression, Tableau, interaction, demo</w:t>
             </w:r>
           </w:p>
         </w:tc>
@@ -3316,7 +3316,7 @@
           <w:rFonts w:ascii="Times New Roman" w:eastAsia="Times New Roman" w:hAnsi="Times New Roman"/>
           <w:sz w:val="25"/>
         </w:rPr>
-        <w:t>11. Bước 8 - Dashboard Power BI</w:t>
+        <w:t>11. Bước 8 - Dashboard Tableau</w:t>
       </w:r>
     </w:p>
     <w:p>
@@ -3442,7 +3442,7 @@
                 <w:rFonts w:eastAsia="Times New Roman"/>
                 <w:sz w:val="20"/>
               </w:rPr>
-              <w:t>Total Students, Average Score, Pass Rate, At-Risk Rate; Histogram, Bar Chart, Map, Line Chart.</w:t>
+              <w:t>KPI và nội dung tổng quan; visual cụ thể chốt sau EDA và Insight Log.</w:t>
             </w:r>
           </w:p>
         </w:tc>
@@ -3490,7 +3490,7 @@
                 <w:rFonts w:eastAsia="Times New Roman"/>
                 <w:sz w:val="20"/>
               </w:rPr>
-              <w:t>Scatter, Boxplot, Heatmap, Treemap, Stacked Bar.</w:t>
+              <w:t>Phân tích yếu tố và tương tác; visual cụ thể chốt sau EDA và Insight Log.</w:t>
             </w:r>
           </w:p>
         </w:tc>
@@ -4492,7 +4492,7 @@
                 <w:rFonts w:eastAsia="Times New Roman"/>
                 <w:sz w:val="18"/>
               </w:rPr>
-              <w:t>Kiểm tra Map/BI</w:t>
+              <w:t>Kiểm tra Map/dashboard</w:t>
             </w:r>
           </w:p>
         </w:tc>
@@ -4672,7 +4672,7 @@
                 <w:rFonts w:eastAsia="Times New Roman"/>
                 <w:sz w:val="18"/>
               </w:rPr>
-              <w:t>Power BI skeleton</w:t>
+              <w:t>Tableau skeleton</w:t>
             </w:r>
           </w:p>
         </w:tc>
@@ -5212,7 +5212,7 @@
                 <w:rFonts w:eastAsia="Times New Roman"/>
                 <w:sz w:val="18"/>
               </w:rPr>
-              <w:t>Phần BI/Model</w:t>
+              <w:t>Phần Dashboard/Model</w:t>
             </w:r>
           </w:p>
         </w:tc>
@@ -5318,333 +5318,10 @@
           <w:rFonts w:ascii="Times New Roman" w:eastAsia="Times New Roman" w:hAnsi="Times New Roman"/>
           <w:sz w:val="25"/>
         </w:rPr>
-        <w:t>15. Timeline 5 tuần</w:t>
-      </w:r>
-    </w:p>
-    <w:tbl>
-      <w:tblPr>
-        <w:tblStyle w:val="TableGrid"/>
-        <w:tblW w:w="0" w:type="auto"/>
-        <w:jc w:val="center"/>
-        <w:tblLook w:val="04A0" w:firstRow="1" w:lastRow="0" w:firstColumn="1" w:lastColumn="0" w:noHBand="0" w:noVBand="1"/>
-      </w:tblPr>
-      <w:tblGrid>
-        <w:gridCol w:w="4901"/>
-        <w:gridCol w:w="4901"/>
-      </w:tblGrid>
-      <w:tr>
-        <w:trPr>
-          <w:jc w:val="center"/>
-        </w:trPr>
-        <w:tc>
-          <w:tcPr>
-            <w:tcW w:w="4901" w:type="dxa"/>
-            <w:shd w:val="clear" w:color="auto" w:fill="D9EAF7"/>
-            <w:tcMar>
-              <w:top w:w="80" w:type="dxa"/>
-              <w:left w:w="100" w:type="dxa"/>
-              <w:bottom w:w="80" w:type="dxa"/>
-              <w:right w:w="100" w:type="dxa"/>
-            </w:tcMar>
-            <w:vAlign w:val="center"/>
-          </w:tcPr>
-          <w:p>
-            <w:pPr>
-              <w:jc w:val="center"/>
-            </w:pPr>
-            <w:r>
-              <w:rPr>
-                <w:rFonts w:eastAsia="Times New Roman"/>
-                <w:b/>
-                <w:sz w:val="21"/>
-              </w:rPr>
-              <w:t>Tuần</w:t>
-            </w:r>
-          </w:p>
-        </w:tc>
-        <w:tc>
-          <w:tcPr>
-            <w:tcW w:w="4901" w:type="dxa"/>
-            <w:shd w:val="clear" w:color="auto" w:fill="D9EAF7"/>
-            <w:tcMar>
-              <w:top w:w="80" w:type="dxa"/>
-              <w:left w:w="100" w:type="dxa"/>
-              <w:bottom w:w="80" w:type="dxa"/>
-              <w:right w:w="100" w:type="dxa"/>
-            </w:tcMar>
-            <w:vAlign w:val="center"/>
-          </w:tcPr>
-          <w:p>
-            <w:pPr>
-              <w:jc w:val="center"/>
-            </w:pPr>
-            <w:r>
-              <w:rPr>
-                <w:rFonts w:eastAsia="Times New Roman"/>
-                <w:b/>
-                <w:sz w:val="21"/>
-              </w:rPr>
-              <w:t>Mục tiêu</w:t>
-            </w:r>
-          </w:p>
-        </w:tc>
-      </w:tr>
-      <w:tr>
-        <w:trPr>
-          <w:jc w:val="center"/>
-        </w:trPr>
-        <w:tc>
-          <w:tcPr>
-            <w:tcW w:w="4901" w:type="dxa"/>
-            <w:tcMar>
-              <w:top w:w="80" w:type="dxa"/>
-              <w:left w:w="100" w:type="dxa"/>
-              <w:bottom w:w="80" w:type="dxa"/>
-              <w:right w:w="100" w:type="dxa"/>
-            </w:tcMar>
-            <w:vAlign w:val="center"/>
-          </w:tcPr>
-          <w:p>
-            <w:pPr>
-              <w:jc w:val="center"/>
-            </w:pPr>
-            <w:r>
-              <w:rPr>
-                <w:rFonts w:eastAsia="Times New Roman"/>
-                <w:b/>
-                <w:sz w:val="20"/>
-              </w:rPr>
-              <w:t>1</w:t>
-            </w:r>
-          </w:p>
-        </w:tc>
-        <w:tc>
-          <w:tcPr>
-            <w:tcW w:w="4901" w:type="dxa"/>
-            <w:tcMar>
-              <w:top w:w="80" w:type="dxa"/>
-              <w:left w:w="100" w:type="dxa"/>
-              <w:bottom w:w="80" w:type="dxa"/>
-              <w:right w:w="100" w:type="dxa"/>
-            </w:tcMar>
-            <w:vAlign w:val="center"/>
-          </w:tcPr>
-          <w:p>
-            <w:r>
-              <w:rPr>
-                <w:rFonts w:eastAsia="Times New Roman"/>
-                <w:sz w:val="20"/>
-              </w:rPr>
-              <w:t>Chốt dataset, Data Dictionary, RQ, hypothesis, dashboard wireframe.</w:t>
-            </w:r>
-          </w:p>
-        </w:tc>
-      </w:tr>
-      <w:tr>
-        <w:trPr>
-          <w:jc w:val="center"/>
-        </w:trPr>
-        <w:tc>
-          <w:tcPr>
-            <w:tcW w:w="4901" w:type="dxa"/>
-            <w:tcMar>
-              <w:top w:w="80" w:type="dxa"/>
-              <w:left w:w="100" w:type="dxa"/>
-              <w:bottom w:w="80" w:type="dxa"/>
-              <w:right w:w="100" w:type="dxa"/>
-            </w:tcMar>
-            <w:vAlign w:val="center"/>
-          </w:tcPr>
-          <w:p>
-            <w:pPr>
-              <w:jc w:val="center"/>
-            </w:pPr>
-            <w:r>
-              <w:rPr>
-                <w:rFonts w:eastAsia="Times New Roman"/>
-                <w:b/>
-                <w:sz w:val="20"/>
-              </w:rPr>
-              <w:t>2</w:t>
-            </w:r>
-          </w:p>
-        </w:tc>
-        <w:tc>
-          <w:tcPr>
-            <w:tcW w:w="4901" w:type="dxa"/>
-            <w:tcMar>
-              <w:top w:w="80" w:type="dxa"/>
-              <w:left w:w="100" w:type="dxa"/>
-              <w:bottom w:w="80" w:type="dxa"/>
-              <w:right w:w="100" w:type="dxa"/>
-            </w:tcMar>
-            <w:vAlign w:val="center"/>
-          </w:tcPr>
-          <w:p>
-            <w:r>
-              <w:rPr>
-                <w:rFonts w:eastAsia="Times New Roman"/>
-                <w:sz w:val="20"/>
-              </w:rPr>
-              <w:t>Cleaning, Merge, calculated fields, EDA cơ bản.</w:t>
-            </w:r>
-          </w:p>
-        </w:tc>
-      </w:tr>
-      <w:tr>
-        <w:trPr>
-          <w:jc w:val="center"/>
-        </w:trPr>
-        <w:tc>
-          <w:tcPr>
-            <w:tcW w:w="4901" w:type="dxa"/>
-            <w:tcMar>
-              <w:top w:w="80" w:type="dxa"/>
-              <w:left w:w="100" w:type="dxa"/>
-              <w:bottom w:w="80" w:type="dxa"/>
-              <w:right w:w="100" w:type="dxa"/>
-            </w:tcMar>
-            <w:vAlign w:val="center"/>
-          </w:tcPr>
-          <w:p>
-            <w:pPr>
-              <w:jc w:val="center"/>
-            </w:pPr>
-            <w:r>
-              <w:rPr>
-                <w:rFonts w:eastAsia="Times New Roman"/>
-                <w:b/>
-                <w:sz w:val="20"/>
-              </w:rPr>
-              <w:t>3</w:t>
-            </w:r>
-          </w:p>
-        </w:tc>
-        <w:tc>
-          <w:tcPr>
-            <w:tcW w:w="4901" w:type="dxa"/>
-            <w:tcMar>
-              <w:top w:w="80" w:type="dxa"/>
-              <w:left w:w="100" w:type="dxa"/>
-              <w:bottom w:w="80" w:type="dxa"/>
-              <w:right w:w="100" w:type="dxa"/>
-            </w:tcMar>
-            <w:vAlign w:val="center"/>
-          </w:tcPr>
-          <w:p>
-            <w:r>
-              <w:rPr>
-                <w:rFonts w:eastAsia="Times New Roman"/>
-                <w:sz w:val="20"/>
-              </w:rPr>
-              <w:t>Deep EDA, interaction, chốt 5-7 insight, dashboard v0.</w:t>
-            </w:r>
-          </w:p>
-        </w:tc>
-      </w:tr>
-      <w:tr>
-        <w:trPr>
-          <w:jc w:val="center"/>
-        </w:trPr>
-        <w:tc>
-          <w:tcPr>
-            <w:tcW w:w="4901" w:type="dxa"/>
-            <w:tcMar>
-              <w:top w:w="80" w:type="dxa"/>
-              <w:left w:w="100" w:type="dxa"/>
-              <w:bottom w:w="80" w:type="dxa"/>
-              <w:right w:w="100" w:type="dxa"/>
-            </w:tcMar>
-            <w:vAlign w:val="center"/>
-          </w:tcPr>
-          <w:p>
-            <w:pPr>
-              <w:jc w:val="center"/>
-            </w:pPr>
-            <w:r>
-              <w:rPr>
-                <w:rFonts w:eastAsia="Times New Roman"/>
-                <w:b/>
-                <w:sz w:val="20"/>
-              </w:rPr>
-              <w:t>4</w:t>
-            </w:r>
-          </w:p>
-        </w:tc>
-        <w:tc>
-          <w:tcPr>
-            <w:tcW w:w="4901" w:type="dxa"/>
-            <w:tcMar>
-              <w:top w:w="80" w:type="dxa"/>
-              <w:left w:w="100" w:type="dxa"/>
-              <w:bottom w:w="80" w:type="dxa"/>
-              <w:right w:w="100" w:type="dxa"/>
-            </w:tcMar>
-            <w:vAlign w:val="center"/>
-          </w:tcPr>
-          <w:p>
-            <w:r>
-              <w:rPr>
-                <w:rFonts w:eastAsia="Times New Roman"/>
-                <w:sz w:val="20"/>
-              </w:rPr>
-              <w:t>Logistic Regression, prediction, dashboard hoàn chỉnh.</w:t>
-            </w:r>
-          </w:p>
-        </w:tc>
-      </w:tr>
-      <w:tr>
-        <w:trPr>
-          <w:jc w:val="center"/>
-        </w:trPr>
-        <w:tc>
-          <w:tcPr>
-            <w:tcW w:w="4901" w:type="dxa"/>
-            <w:tcMar>
-              <w:top w:w="80" w:type="dxa"/>
-              <w:left w:w="100" w:type="dxa"/>
-              <w:bottom w:w="80" w:type="dxa"/>
-              <w:right w:w="100" w:type="dxa"/>
-            </w:tcMar>
-            <w:vAlign w:val="center"/>
-          </w:tcPr>
-          <w:p>
-            <w:pPr>
-              <w:jc w:val="center"/>
-            </w:pPr>
-            <w:r>
-              <w:rPr>
-                <w:rFonts w:eastAsia="Times New Roman"/>
-                <w:b/>
-                <w:sz w:val="20"/>
-              </w:rPr>
-              <w:t>5</w:t>
-            </w:r>
-          </w:p>
-        </w:tc>
-        <w:tc>
-          <w:tcPr>
-            <w:tcW w:w="4901" w:type="dxa"/>
-            <w:tcMar>
-              <w:top w:w="80" w:type="dxa"/>
-              <w:left w:w="100" w:type="dxa"/>
-              <w:bottom w:w="80" w:type="dxa"/>
-              <w:right w:w="100" w:type="dxa"/>
-            </w:tcMar>
-            <w:vAlign w:val="center"/>
-          </w:tcPr>
-          <w:p>
-            <w:r>
-              <w:rPr>
-                <w:rFonts w:eastAsia="Times New Roman"/>
-                <w:sz w:val="20"/>
-              </w:rPr>
-              <w:t>QA, báo cáo, slide, video, luyện vấn đáp.</w:t>
-            </w:r>
-          </w:p>
-        </w:tc>
-      </w:tr>
-    </w:tbl>
+        <w:lastRenderedPageBreak/>
+        <w:t>15. Pipeline cuối cùng</w:t>
+      </w:r>
+    </w:p>
     <w:p>
       <w:pPr>
         <w:spacing w:after="80"/>
@@ -5654,7 +5331,7 @@
           <w:rFonts w:eastAsia="Times New Roman"/>
           <w:b/>
         </w:rPr>
-        <w:t>Mốc freeze: Cuối tuần 2 - Data Freeze; Cuối tuần 3 - Insight Freeze; Giữa tuần 5 - Dashboard Freeze.</w:t>
+        <w:t>Bài toán -&gt; Dataset &gt;= 5.000 + &gt;= 3 bảng -&gt; Data Dictionary -&gt; Audit -&gt; Cleaning -&gt; Join/Merge -&gt; Feature Engineering -&gt; EDA -&gt; Interaction Analysis -&gt; 5-7 Main Insights -&gt; Risk Profile -&gt; Logistic Regression -&gt; Prediction -&gt; Tableau Dashboard -&gt; Storytelling -&gt; Report + Demo + Defense.</w:t>
       </w:r>
     </w:p>
     <w:p>
@@ -5667,33 +5344,7 @@
           <w:rFonts w:ascii="Times New Roman" w:eastAsia="Times New Roman" w:hAnsi="Times New Roman"/>
           <w:sz w:val="25"/>
         </w:rPr>
-        <w:lastRenderedPageBreak/>
-        <w:t>16. Pipeline cuối cùng</w:t>
-      </w:r>
-    </w:p>
-    <w:p>
-      <w:pPr>
-        <w:spacing w:after="80"/>
-      </w:pPr>
-      <w:r>
-        <w:rPr>
-          <w:rFonts w:eastAsia="Times New Roman"/>
-          <w:b/>
-        </w:rPr>
-        <w:t>Bài toán -&gt; Dataset &gt;= 5.000 + &gt;= 3 bảng -&gt; Data Dictionary -&gt; Audit -&gt; Cleaning -&gt; Join/Merge -&gt; Feature Engineering -&gt; EDA -&gt; Interaction Analysis -&gt; 5-7 Main Insights -&gt; Risk Profile -&gt; Logistic Regression -&gt; Prediction -&gt; Power BI Dashboard -&gt; Storytelling -&gt; Report + Demo + Defense.</w:t>
-      </w:r>
-    </w:p>
-    <w:p>
-      <w:pPr>
-        <w:pStyle w:val="Heading2"/>
-        <w:spacing w:before="100" w:after="80"/>
-      </w:pPr>
-      <w:r>
-        <w:rPr>
-          <w:rFonts w:ascii="Times New Roman" w:eastAsia="Times New Roman" w:hAnsi="Times New Roman"/>
-          <w:sz w:val="25"/>
-        </w:rPr>
-        <w:t>17. Phương án chốt</w:t>
+        <w:t>16. Phương án chốt</w:t>
       </w:r>
     </w:p>
     <w:p>
@@ -5710,7 +5361,7 @@
           <w:rFonts w:eastAsia="Times New Roman"/>
           <w:b/>
         </w:rPr>
-        <w:t>TV1 Data - TV2 Analysis - TV3 BI/Model; sử dụng Python + Power BI; Logistic Regression với target At_Risk; Dashboard 4 trang; trọng tâm phân tích là interaction + risk profile thay vì chỉ phân tích từng yếu tố riêng lẻ.</w:t>
+        <w:t>TV1 Data - TV2 Analysis - TV3 Dashboard/Model; sử dụng Python + Tableau; Logistic Regression với target At_Risk; Dashboard 4 trang; trọng tâm phân tích là interaction + risk profile thay vì chỉ phân tích từng yếu tố riêng lẻ.</w:t>
       </w:r>
     </w:p>
     <w:p>
@@ -6216,7 +5867,7 @@
         <w:spacing w:after="80"/>
       </w:pPr>
       <w:r>
-        <w:t>Logistic Regression + Power BI</w:t>
+        <w:t>Logistic Regression + Tableau</w:t>
       </w:r>
     </w:p>
     <w:p>

</xml_diff>

<commit_message>
Chốt Tableau làm công cụ dashboard (#21)
Refs #7. Chỉ chốt công cụ; phương án visual và dashboard v0 vẫn chờ các task phụ thuộc.
</commit_message>
<xml_diff>
--- a/docs/source/TTDLTQ_script.docx
+++ b/docs/source/TTDLTQ_script.docx
@@ -2115,7 +2115,7 @@
           <w:rFonts w:eastAsia="Times New Roman"/>
           <w:sz w:val="23"/>
         </w:rPr>
-        <w:t>Power BI để xây dựng Dashboard, Filter, Drill-down, Tooltip và Cross-filtering.</w:t>
+        <w:t>Tableau để xây dựng Dashboard, Filter, Drill-down, Tooltip và Cross-filtering.</w:t>
       </w:r>
     </w:p>
     <w:p>
@@ -2419,7 +2419,7 @@
                 <w:rFonts w:eastAsia="Times New Roman"/>
                 <w:sz w:val="20"/>
               </w:rPr>
-              <w:t>BI + Model</w:t>
+              <w:t>Dashboard + Model</w:t>
             </w:r>
           </w:p>
         </w:tc>
@@ -2440,7 +2440,7 @@
                 <w:rFonts w:eastAsia="Times New Roman"/>
                 <w:sz w:val="20"/>
               </w:rPr>
-              <w:t>Logistic Regression, Power BI, interaction, demo</w:t>
+              <w:t>Logistic Regression, Tableau, interaction, demo</w:t>
             </w:r>
           </w:p>
         </w:tc>
@@ -3316,7 +3316,7 @@
           <w:rFonts w:ascii="Times New Roman" w:eastAsia="Times New Roman" w:hAnsi="Times New Roman"/>
           <w:sz w:val="25"/>
         </w:rPr>
-        <w:t>11. Bước 8 - Dashboard Power BI</w:t>
+        <w:t>11. Bước 8 - Dashboard Tableau</w:t>
       </w:r>
     </w:p>
     <w:p>
@@ -3442,7 +3442,7 @@
                 <w:rFonts w:eastAsia="Times New Roman"/>
                 <w:sz w:val="20"/>
               </w:rPr>
-              <w:t>Total Students, Average Score, Pass Rate, At-Risk Rate; Histogram, Bar Chart, Map, Line Chart.</w:t>
+              <w:t>KPI và nội dung tổng quan; visual cụ thể chốt sau EDA và Insight Log.</w:t>
             </w:r>
           </w:p>
         </w:tc>
@@ -3490,7 +3490,7 @@
                 <w:rFonts w:eastAsia="Times New Roman"/>
                 <w:sz w:val="20"/>
               </w:rPr>
-              <w:t>Scatter, Boxplot, Heatmap, Treemap, Stacked Bar.</w:t>
+              <w:t>Phân tích yếu tố và tương tác; visual cụ thể chốt sau EDA và Insight Log.</w:t>
             </w:r>
           </w:p>
         </w:tc>
@@ -4492,7 +4492,7 @@
                 <w:rFonts w:eastAsia="Times New Roman"/>
                 <w:sz w:val="18"/>
               </w:rPr>
-              <w:t>Kiểm tra Map/BI</w:t>
+              <w:t>Kiểm tra Map/dashboard</w:t>
             </w:r>
           </w:p>
         </w:tc>
@@ -4672,7 +4672,7 @@
                 <w:rFonts w:eastAsia="Times New Roman"/>
                 <w:sz w:val="18"/>
               </w:rPr>
-              <w:t>Power BI skeleton</w:t>
+              <w:t>Tableau skeleton</w:t>
             </w:r>
           </w:p>
         </w:tc>
@@ -5212,7 +5212,7 @@
                 <w:rFonts w:eastAsia="Times New Roman"/>
                 <w:sz w:val="18"/>
               </w:rPr>
-              <w:t>Phần BI/Model</w:t>
+              <w:t>Phần Dashboard/Model</w:t>
             </w:r>
           </w:p>
         </w:tc>
@@ -5318,333 +5318,10 @@
           <w:rFonts w:ascii="Times New Roman" w:eastAsia="Times New Roman" w:hAnsi="Times New Roman"/>
           <w:sz w:val="25"/>
         </w:rPr>
-        <w:t>15. Timeline 5 tuần</w:t>
-      </w:r>
-    </w:p>
-    <w:tbl>
-      <w:tblPr>
-        <w:tblStyle w:val="TableGrid"/>
-        <w:tblW w:w="0" w:type="auto"/>
-        <w:jc w:val="center"/>
-        <w:tblLook w:val="04A0" w:firstRow="1" w:lastRow="0" w:firstColumn="1" w:lastColumn="0" w:noHBand="0" w:noVBand="1"/>
-      </w:tblPr>
-      <w:tblGrid>
-        <w:gridCol w:w="4901"/>
-        <w:gridCol w:w="4901"/>
-      </w:tblGrid>
-      <w:tr>
-        <w:trPr>
-          <w:jc w:val="center"/>
-        </w:trPr>
-        <w:tc>
-          <w:tcPr>
-            <w:tcW w:w="4901" w:type="dxa"/>
-            <w:shd w:val="clear" w:color="auto" w:fill="D9EAF7"/>
-            <w:tcMar>
-              <w:top w:w="80" w:type="dxa"/>
-              <w:left w:w="100" w:type="dxa"/>
-              <w:bottom w:w="80" w:type="dxa"/>
-              <w:right w:w="100" w:type="dxa"/>
-            </w:tcMar>
-            <w:vAlign w:val="center"/>
-          </w:tcPr>
-          <w:p>
-            <w:pPr>
-              <w:jc w:val="center"/>
-            </w:pPr>
-            <w:r>
-              <w:rPr>
-                <w:rFonts w:eastAsia="Times New Roman"/>
-                <w:b/>
-                <w:sz w:val="21"/>
-              </w:rPr>
-              <w:t>Tuần</w:t>
-            </w:r>
-          </w:p>
-        </w:tc>
-        <w:tc>
-          <w:tcPr>
-            <w:tcW w:w="4901" w:type="dxa"/>
-            <w:shd w:val="clear" w:color="auto" w:fill="D9EAF7"/>
-            <w:tcMar>
-              <w:top w:w="80" w:type="dxa"/>
-              <w:left w:w="100" w:type="dxa"/>
-              <w:bottom w:w="80" w:type="dxa"/>
-              <w:right w:w="100" w:type="dxa"/>
-            </w:tcMar>
-            <w:vAlign w:val="center"/>
-          </w:tcPr>
-          <w:p>
-            <w:pPr>
-              <w:jc w:val="center"/>
-            </w:pPr>
-            <w:r>
-              <w:rPr>
-                <w:rFonts w:eastAsia="Times New Roman"/>
-                <w:b/>
-                <w:sz w:val="21"/>
-              </w:rPr>
-              <w:t>Mục tiêu</w:t>
-            </w:r>
-          </w:p>
-        </w:tc>
-      </w:tr>
-      <w:tr>
-        <w:trPr>
-          <w:jc w:val="center"/>
-        </w:trPr>
-        <w:tc>
-          <w:tcPr>
-            <w:tcW w:w="4901" w:type="dxa"/>
-            <w:tcMar>
-              <w:top w:w="80" w:type="dxa"/>
-              <w:left w:w="100" w:type="dxa"/>
-              <w:bottom w:w="80" w:type="dxa"/>
-              <w:right w:w="100" w:type="dxa"/>
-            </w:tcMar>
-            <w:vAlign w:val="center"/>
-          </w:tcPr>
-          <w:p>
-            <w:pPr>
-              <w:jc w:val="center"/>
-            </w:pPr>
-            <w:r>
-              <w:rPr>
-                <w:rFonts w:eastAsia="Times New Roman"/>
-                <w:b/>
-                <w:sz w:val="20"/>
-              </w:rPr>
-              <w:t>1</w:t>
-            </w:r>
-          </w:p>
-        </w:tc>
-        <w:tc>
-          <w:tcPr>
-            <w:tcW w:w="4901" w:type="dxa"/>
-            <w:tcMar>
-              <w:top w:w="80" w:type="dxa"/>
-              <w:left w:w="100" w:type="dxa"/>
-              <w:bottom w:w="80" w:type="dxa"/>
-              <w:right w:w="100" w:type="dxa"/>
-            </w:tcMar>
-            <w:vAlign w:val="center"/>
-          </w:tcPr>
-          <w:p>
-            <w:r>
-              <w:rPr>
-                <w:rFonts w:eastAsia="Times New Roman"/>
-                <w:sz w:val="20"/>
-              </w:rPr>
-              <w:t>Chốt dataset, Data Dictionary, RQ, hypothesis, dashboard wireframe.</w:t>
-            </w:r>
-          </w:p>
-        </w:tc>
-      </w:tr>
-      <w:tr>
-        <w:trPr>
-          <w:jc w:val="center"/>
-        </w:trPr>
-        <w:tc>
-          <w:tcPr>
-            <w:tcW w:w="4901" w:type="dxa"/>
-            <w:tcMar>
-              <w:top w:w="80" w:type="dxa"/>
-              <w:left w:w="100" w:type="dxa"/>
-              <w:bottom w:w="80" w:type="dxa"/>
-              <w:right w:w="100" w:type="dxa"/>
-            </w:tcMar>
-            <w:vAlign w:val="center"/>
-          </w:tcPr>
-          <w:p>
-            <w:pPr>
-              <w:jc w:val="center"/>
-            </w:pPr>
-            <w:r>
-              <w:rPr>
-                <w:rFonts w:eastAsia="Times New Roman"/>
-                <w:b/>
-                <w:sz w:val="20"/>
-              </w:rPr>
-              <w:t>2</w:t>
-            </w:r>
-          </w:p>
-        </w:tc>
-        <w:tc>
-          <w:tcPr>
-            <w:tcW w:w="4901" w:type="dxa"/>
-            <w:tcMar>
-              <w:top w:w="80" w:type="dxa"/>
-              <w:left w:w="100" w:type="dxa"/>
-              <w:bottom w:w="80" w:type="dxa"/>
-              <w:right w:w="100" w:type="dxa"/>
-            </w:tcMar>
-            <w:vAlign w:val="center"/>
-          </w:tcPr>
-          <w:p>
-            <w:r>
-              <w:rPr>
-                <w:rFonts w:eastAsia="Times New Roman"/>
-                <w:sz w:val="20"/>
-              </w:rPr>
-              <w:t>Cleaning, Merge, calculated fields, EDA cơ bản.</w:t>
-            </w:r>
-          </w:p>
-        </w:tc>
-      </w:tr>
-      <w:tr>
-        <w:trPr>
-          <w:jc w:val="center"/>
-        </w:trPr>
-        <w:tc>
-          <w:tcPr>
-            <w:tcW w:w="4901" w:type="dxa"/>
-            <w:tcMar>
-              <w:top w:w="80" w:type="dxa"/>
-              <w:left w:w="100" w:type="dxa"/>
-              <w:bottom w:w="80" w:type="dxa"/>
-              <w:right w:w="100" w:type="dxa"/>
-            </w:tcMar>
-            <w:vAlign w:val="center"/>
-          </w:tcPr>
-          <w:p>
-            <w:pPr>
-              <w:jc w:val="center"/>
-            </w:pPr>
-            <w:r>
-              <w:rPr>
-                <w:rFonts w:eastAsia="Times New Roman"/>
-                <w:b/>
-                <w:sz w:val="20"/>
-              </w:rPr>
-              <w:t>3</w:t>
-            </w:r>
-          </w:p>
-        </w:tc>
-        <w:tc>
-          <w:tcPr>
-            <w:tcW w:w="4901" w:type="dxa"/>
-            <w:tcMar>
-              <w:top w:w="80" w:type="dxa"/>
-              <w:left w:w="100" w:type="dxa"/>
-              <w:bottom w:w="80" w:type="dxa"/>
-              <w:right w:w="100" w:type="dxa"/>
-            </w:tcMar>
-            <w:vAlign w:val="center"/>
-          </w:tcPr>
-          <w:p>
-            <w:r>
-              <w:rPr>
-                <w:rFonts w:eastAsia="Times New Roman"/>
-                <w:sz w:val="20"/>
-              </w:rPr>
-              <w:t>Deep EDA, interaction, chốt 5-7 insight, dashboard v0.</w:t>
-            </w:r>
-          </w:p>
-        </w:tc>
-      </w:tr>
-      <w:tr>
-        <w:trPr>
-          <w:jc w:val="center"/>
-        </w:trPr>
-        <w:tc>
-          <w:tcPr>
-            <w:tcW w:w="4901" w:type="dxa"/>
-            <w:tcMar>
-              <w:top w:w="80" w:type="dxa"/>
-              <w:left w:w="100" w:type="dxa"/>
-              <w:bottom w:w="80" w:type="dxa"/>
-              <w:right w:w="100" w:type="dxa"/>
-            </w:tcMar>
-            <w:vAlign w:val="center"/>
-          </w:tcPr>
-          <w:p>
-            <w:pPr>
-              <w:jc w:val="center"/>
-            </w:pPr>
-            <w:r>
-              <w:rPr>
-                <w:rFonts w:eastAsia="Times New Roman"/>
-                <w:b/>
-                <w:sz w:val="20"/>
-              </w:rPr>
-              <w:t>4</w:t>
-            </w:r>
-          </w:p>
-        </w:tc>
-        <w:tc>
-          <w:tcPr>
-            <w:tcW w:w="4901" w:type="dxa"/>
-            <w:tcMar>
-              <w:top w:w="80" w:type="dxa"/>
-              <w:left w:w="100" w:type="dxa"/>
-              <w:bottom w:w="80" w:type="dxa"/>
-              <w:right w:w="100" w:type="dxa"/>
-            </w:tcMar>
-            <w:vAlign w:val="center"/>
-          </w:tcPr>
-          <w:p>
-            <w:r>
-              <w:rPr>
-                <w:rFonts w:eastAsia="Times New Roman"/>
-                <w:sz w:val="20"/>
-              </w:rPr>
-              <w:t>Logistic Regression, prediction, dashboard hoàn chỉnh.</w:t>
-            </w:r>
-          </w:p>
-        </w:tc>
-      </w:tr>
-      <w:tr>
-        <w:trPr>
-          <w:jc w:val="center"/>
-        </w:trPr>
-        <w:tc>
-          <w:tcPr>
-            <w:tcW w:w="4901" w:type="dxa"/>
-            <w:tcMar>
-              <w:top w:w="80" w:type="dxa"/>
-              <w:left w:w="100" w:type="dxa"/>
-              <w:bottom w:w="80" w:type="dxa"/>
-              <w:right w:w="100" w:type="dxa"/>
-            </w:tcMar>
-            <w:vAlign w:val="center"/>
-          </w:tcPr>
-          <w:p>
-            <w:pPr>
-              <w:jc w:val="center"/>
-            </w:pPr>
-            <w:r>
-              <w:rPr>
-                <w:rFonts w:eastAsia="Times New Roman"/>
-                <w:b/>
-                <w:sz w:val="20"/>
-              </w:rPr>
-              <w:t>5</w:t>
-            </w:r>
-          </w:p>
-        </w:tc>
-        <w:tc>
-          <w:tcPr>
-            <w:tcW w:w="4901" w:type="dxa"/>
-            <w:tcMar>
-              <w:top w:w="80" w:type="dxa"/>
-              <w:left w:w="100" w:type="dxa"/>
-              <w:bottom w:w="80" w:type="dxa"/>
-              <w:right w:w="100" w:type="dxa"/>
-            </w:tcMar>
-            <w:vAlign w:val="center"/>
-          </w:tcPr>
-          <w:p>
-            <w:r>
-              <w:rPr>
-                <w:rFonts w:eastAsia="Times New Roman"/>
-                <w:sz w:val="20"/>
-              </w:rPr>
-              <w:t>QA, báo cáo, slide, video, luyện vấn đáp.</w:t>
-            </w:r>
-          </w:p>
-        </w:tc>
-      </w:tr>
-    </w:tbl>
+        <w:lastRenderedPageBreak/>
+        <w:t>15. Pipeline cuối cùng</w:t>
+      </w:r>
+    </w:p>
     <w:p>
       <w:pPr>
         <w:spacing w:after="80"/>
@@ -5654,7 +5331,7 @@
           <w:rFonts w:eastAsia="Times New Roman"/>
           <w:b/>
         </w:rPr>
-        <w:t>Mốc freeze: Cuối tuần 2 - Data Freeze; Cuối tuần 3 - Insight Freeze; Giữa tuần 5 - Dashboard Freeze.</w:t>
+        <w:t>Bài toán -&gt; Dataset &gt;= 5.000 + &gt;= 3 bảng -&gt; Data Dictionary -&gt; Audit -&gt; Cleaning -&gt; Join/Merge -&gt; Feature Engineering -&gt; EDA -&gt; Interaction Analysis -&gt; 5-7 Main Insights -&gt; Risk Profile -&gt; Logistic Regression -&gt; Prediction -&gt; Tableau Dashboard -&gt; Storytelling -&gt; Report + Demo + Defense.</w:t>
       </w:r>
     </w:p>
     <w:p>
@@ -5667,33 +5344,7 @@
           <w:rFonts w:ascii="Times New Roman" w:eastAsia="Times New Roman" w:hAnsi="Times New Roman"/>
           <w:sz w:val="25"/>
         </w:rPr>
-        <w:lastRenderedPageBreak/>
-        <w:t>16. Pipeline cuối cùng</w:t>
-      </w:r>
-    </w:p>
-    <w:p>
-      <w:pPr>
-        <w:spacing w:after="80"/>
-      </w:pPr>
-      <w:r>
-        <w:rPr>
-          <w:rFonts w:eastAsia="Times New Roman"/>
-          <w:b/>
-        </w:rPr>
-        <w:t>Bài toán -&gt; Dataset &gt;= 5.000 + &gt;= 3 bảng -&gt; Data Dictionary -&gt; Audit -&gt; Cleaning -&gt; Join/Merge -&gt; Feature Engineering -&gt; EDA -&gt; Interaction Analysis -&gt; 5-7 Main Insights -&gt; Risk Profile -&gt; Logistic Regression -&gt; Prediction -&gt; Power BI Dashboard -&gt; Storytelling -&gt; Report + Demo + Defense.</w:t>
-      </w:r>
-    </w:p>
-    <w:p>
-      <w:pPr>
-        <w:pStyle w:val="Heading2"/>
-        <w:spacing w:before="100" w:after="80"/>
-      </w:pPr>
-      <w:r>
-        <w:rPr>
-          <w:rFonts w:ascii="Times New Roman" w:eastAsia="Times New Roman" w:hAnsi="Times New Roman"/>
-          <w:sz w:val="25"/>
-        </w:rPr>
-        <w:t>17. Phương án chốt</w:t>
+        <w:t>16. Phương án chốt</w:t>
       </w:r>
     </w:p>
     <w:p>
@@ -5710,7 +5361,7 @@
           <w:rFonts w:eastAsia="Times New Roman"/>
           <w:b/>
         </w:rPr>
-        <w:t>TV1 Data - TV2 Analysis - TV3 BI/Model; sử dụng Python + Power BI; Logistic Regression với target At_Risk; Dashboard 4 trang; trọng tâm phân tích là interaction + risk profile thay vì chỉ phân tích từng yếu tố riêng lẻ.</w:t>
+        <w:t>TV1 Data - TV2 Analysis - TV3 Dashboard/Model; sử dụng Python + Tableau; Logistic Regression với target At_Risk; Dashboard 4 trang; trọng tâm phân tích là interaction + risk profile thay vì chỉ phân tích từng yếu tố riêng lẻ.</w:t>
       </w:r>
     </w:p>
     <w:p>
@@ -6216,7 +5867,7 @@
         <w:spacing w:after="80"/>
       </w:pPr>
       <w:r>
-        <w:t>Logistic Regression + Power BI</w:t>
+        <w:t>Logistic Regression + Tableau</w:t>
       </w:r>
     </w:p>
     <w:p>

</xml_diff>

<commit_message>
docs(model): plan Logistic and Random Forest comparison
</commit_message>
<xml_diff>
--- a/docs/source/TTDLTQ_script.docx
+++ b/docs/source/TTDLTQ_script.docx
@@ -195,11 +195,7 @@
         <w:spacing w:after="40" w:line="264" w:lineRule="auto"/>
       </w:pPr>
       <w:r>
-        <w:rPr>
-          <w:rFonts w:eastAsia="Times New Roman"/>
-          <w:sz w:val="23"/>
-        </w:rPr>
-        <w:t>Xây dựng mô hình Logistic Regression để dự đoán trạng thái At-Risk / Not-At-Risk.</w:t>
+        <w:t>Xây dựng và so sánh Logistic Regression với Random Forest để dự đoán trạng thái At-Risk / Not-At-Risk; Logistic Regression vẫn là mô hình bắt buộc theo rubric.</w:t>
       </w:r>
     </w:p>
     <w:p>
@@ -2098,11 +2094,7 @@
         <w:spacing w:after="40" w:line="264" w:lineRule="auto"/>
       </w:pPr>
       <w:r>
-        <w:rPr>
-          <w:rFonts w:eastAsia="Times New Roman"/>
-          <w:sz w:val="23"/>
-        </w:rPr>
-        <w:t>scikit-learn để xây dựng Logistic Regression.</w:t>
+        <w:t>scikit-learn để xây dựng Logistic Regression và Random Forest trên cùng dữ liệu/split.</w:t>
       </w:r>
     </w:p>
     <w:p>
@@ -2123,11 +2115,7 @@
         <w:spacing w:after="80"/>
       </w:pPr>
       <w:r>
-        <w:rPr>
-          <w:rFonts w:eastAsia="Times New Roman"/>
-          <w:b/>
-        </w:rPr>
-        <w:t>Mô hình chốt: Logistic Regression. Target: At_Risk = 1, Not_At_Risk = 0.</w:t>
+        <w:t>Mô hình chốt: Logistic Regression bắt buộc và Random Forest đối chứng. Target: At_Risk = 1, Not_At_Risk = 0.</w:t>
       </w:r>
     </w:p>
     <w:p>
@@ -2694,11 +2682,7 @@
         <w:spacing w:after="40" w:line="264" w:lineRule="auto"/>
       </w:pPr>
       <w:r>
-        <w:rPr>
-          <w:rFonts w:eastAsia="Times New Roman"/>
-          <w:sz w:val="23"/>
-        </w:rPr>
-        <w:t>RQ6. Có thể nhận diện sinh viên At-Risk bằng Logistic Regression không?</w:t>
+        <w:t>RQ6. Logistic Regression và Random Forest nhận diện At-Risk hiệu quả ra sao trên cùng dữ liệu dự báo sớm?</w:t>
       </w:r>
     </w:p>
     <w:p>
@@ -3253,11 +3237,7 @@
         <w:spacing w:before="100" w:after="80"/>
       </w:pPr>
       <w:r>
-        <w:rPr>
-          <w:rFonts w:ascii="Times New Roman" w:eastAsia="Times New Roman" w:hAnsi="Times New Roman"/>
-          <w:sz w:val="25"/>
-        </w:rPr>
-        <w:t>10. Bước 7 - Logistic Regression</w:t>
+        <w:t>10. Bước 7 - So sánh Logistic Regression và Random Forest</w:t>
       </w:r>
     </w:p>
     <w:p>
@@ -3277,10 +3257,7 @@
         <w:spacing w:after="80"/>
       </w:pPr>
       <w:r>
-        <w:rPr>
-          <w:rFonts w:eastAsia="Times New Roman"/>
-        </w:rPr>
-        <w:t>Target: At_Risk. Features: Attendance, Study Hours, Previous Grade, Sleep Hours, Socioeconomic,...</w:t>
+        <w:t>Target: At_Risk. Features: thông tin nền/bối cảnh môn học và VLE/assessment chỉ đến cutoff; cấm target, withdrawal tương lai và aggregate toàn khóa.</w:t>
       </w:r>
     </w:p>
     <w:p>
@@ -3288,10 +3265,7 @@
         <w:spacing w:after="80"/>
       </w:pPr>
       <w:r>
-        <w:rPr>
-          <w:rFonts w:eastAsia="Times New Roman"/>
-        </w:rPr>
-        <w:t>Pipeline: Clean Data -&gt; Select Features -&gt; Encode -&gt; Train/Test Split -&gt; Logistic Regression -&gt; Evaluate -&gt; Risk Probability.</w:t>
+        <w:t>Pipeline: Clean Raw -&gt; Feature theo Cutoff -&gt; Group Train/Validation/Test Split -&gt; Baseline -&gt; Logistic Regression + Random Forest -&gt; Compare -&gt; Threshold -&gt; Risk Probability.</w:t>
       </w:r>
     </w:p>
     <w:p>
@@ -3299,11 +3273,7 @@
         <w:spacing w:after="80"/>
       </w:pPr>
       <w:r>
-        <w:rPr>
-          <w:rFonts w:eastAsia="Times New Roman"/>
-          <w:b/>
-        </w:rPr>
-        <w:t>Output: student_id, actual_status, predicted_status, risk_probability.</w:t>
+        <w:t>Output: code_module, code_presentation, id_student, model_name, actual_status, predicted_status, risk_probability, split, cutoff, threshold và model_version.</w:t>
       </w:r>
     </w:p>
     <w:p>
@@ -5327,11 +5297,7 @@
         <w:spacing w:after="80"/>
       </w:pPr>
       <w:r>
-        <w:rPr>
-          <w:rFonts w:eastAsia="Times New Roman"/>
-          <w:b/>
-        </w:rPr>
-        <w:t>Bài toán -&gt; Dataset &gt;= 5.000 + &gt;= 3 bảng -&gt; Data Dictionary -&gt; Audit -&gt; Cleaning -&gt; Join/Merge -&gt; Feature Engineering -&gt; EDA -&gt; Interaction Analysis -&gt; 5-7 Main Insights -&gt; Risk Profile -&gt; Logistic Regression -&gt; Prediction -&gt; Tableau Dashboard -&gt; Storytelling -&gt; Report + Demo + Defense.</w:t>
+        <w:t>Bài toán -&gt; Dataset &gt;= 5.000 + &gt;= 3 bảng -&gt; Data Dictionary -&gt; Audit -&gt; Cleaning -&gt; Feature theo Cutoff -&gt; EDA -&gt; Interaction Analysis -&gt; 5-7 Main Insights -&gt; Risk Profile -&gt; Logistic Regression + Random Forest -&gt; Model Comparison -&gt; Prediction -&gt; Tableau Dashboard -&gt; Storytelling -&gt; Report + Demo + Defense.</w:t>
       </w:r>
     </w:p>
     <w:p>
@@ -5357,11 +5323,7 @@
         </w:rPr>
       </w:pPr>
       <w:r>
-        <w:rPr>
-          <w:rFonts w:eastAsia="Times New Roman"/>
-          <w:b/>
-        </w:rPr>
-        <w:t>TV1 Data - TV2 Analysis - TV3 Dashboard/Model; sử dụng Python + Tableau; Logistic Regression với target At_Risk; Dashboard 4 trang; trọng tâm phân tích là interaction + risk profile thay vì chỉ phân tích từng yếu tố riêng lẻ.</w:t>
+        <w:t>TV1 Data - TV2 Analysis - TV3 Dashboard/Model; sử dụng Python + Tableau; Logistic Regression bắt buộc và Random Forest đối chứng với target At_Risk; Dashboard 4 trang; trọng tâm là interaction + risk profile và so sánh mô hình công bằng.</w:t>
       </w:r>
     </w:p>
     <w:p>
@@ -5723,26 +5685,8 @@
         <w:spacing w:after="80"/>
       </w:pPr>
       <w:r>
-        <w:t xml:space="preserve">và dùng </w:t>
-      </w:r>
-      <w:r>
-        <w:rPr>
-          <w:b/>
-          <w:bCs/>
-        </w:rPr>
-        <w:t>Logistic Regression</w:t>
-      </w:r>
-      <w:r>
-        <w:t xml:space="preserve"> đúng rubric. OULAD cũng được UCI ghi nhận là phù hợp cho classification và regression. </w:t>
-      </w:r>
-      <w:hyperlink r:id="rId11" w:history="1">
-        <w:r>
-          <w:rPr>
-            <w:rStyle w:val="Hyperlink"/>
-          </w:rPr>
-          <w:t>UCI Archive</w:t>
-        </w:r>
-      </w:hyperlink>
+        <w:t>và dùng Logistic Regression đúng rubric, đồng thời so sánh Random Forest trên cùng dữ liệu/split. OULAD cũng được UCI ghi nhận là phù hợp cho classification và regression. UCI Archive</w:t>
+      </w:r>
     </w:p>
     <w:p>
       <w:pPr>
@@ -5867,7 +5811,7 @@
         <w:spacing w:after="80"/>
       </w:pPr>
       <w:r>
-        <w:t>Logistic Regression + Tableau</w:t>
+        <w:t>Logistic Regression + Random Forest + Tableau</w:t>
       </w:r>
     </w:p>
     <w:p>

</xml_diff>

<commit_message>
Chốt phương án so sánh hai mô hình (#22)
Refs #8. Giữ Logistic Regression theo rubric và thêm Random Forest đối chứng; T13 vẫn mở chờ dữ liệu cutoff và thực nghiệm.
</commit_message>
<xml_diff>
--- a/docs/source/TTDLTQ_script.docx
+++ b/docs/source/TTDLTQ_script.docx
@@ -195,11 +195,7 @@
         <w:spacing w:after="40" w:line="264" w:lineRule="auto"/>
       </w:pPr>
       <w:r>
-        <w:rPr>
-          <w:rFonts w:eastAsia="Times New Roman"/>
-          <w:sz w:val="23"/>
-        </w:rPr>
-        <w:t>Xây dựng mô hình Logistic Regression để dự đoán trạng thái At-Risk / Not-At-Risk.</w:t>
+        <w:t>Xây dựng và so sánh Logistic Regression với Random Forest để dự đoán trạng thái At-Risk / Not-At-Risk; Logistic Regression vẫn là mô hình bắt buộc theo rubric.</w:t>
       </w:r>
     </w:p>
     <w:p>
@@ -2098,11 +2094,7 @@
         <w:spacing w:after="40" w:line="264" w:lineRule="auto"/>
       </w:pPr>
       <w:r>
-        <w:rPr>
-          <w:rFonts w:eastAsia="Times New Roman"/>
-          <w:sz w:val="23"/>
-        </w:rPr>
-        <w:t>scikit-learn để xây dựng Logistic Regression.</w:t>
+        <w:t>scikit-learn để xây dựng Logistic Regression và Random Forest trên cùng dữ liệu/split.</w:t>
       </w:r>
     </w:p>
     <w:p>
@@ -2123,11 +2115,7 @@
         <w:spacing w:after="80"/>
       </w:pPr>
       <w:r>
-        <w:rPr>
-          <w:rFonts w:eastAsia="Times New Roman"/>
-          <w:b/>
-        </w:rPr>
-        <w:t>Mô hình chốt: Logistic Regression. Target: At_Risk = 1, Not_At_Risk = 0.</w:t>
+        <w:t>Mô hình chốt: Logistic Regression bắt buộc và Random Forest đối chứng. Target: At_Risk = 1, Not_At_Risk = 0.</w:t>
       </w:r>
     </w:p>
     <w:p>
@@ -2694,11 +2682,7 @@
         <w:spacing w:after="40" w:line="264" w:lineRule="auto"/>
       </w:pPr>
       <w:r>
-        <w:rPr>
-          <w:rFonts w:eastAsia="Times New Roman"/>
-          <w:sz w:val="23"/>
-        </w:rPr>
-        <w:t>RQ6. Có thể nhận diện sinh viên At-Risk bằng Logistic Regression không?</w:t>
+        <w:t>RQ6. Logistic Regression và Random Forest nhận diện At-Risk hiệu quả ra sao trên cùng dữ liệu dự báo sớm?</w:t>
       </w:r>
     </w:p>
     <w:p>
@@ -3253,11 +3237,7 @@
         <w:spacing w:before="100" w:after="80"/>
       </w:pPr>
       <w:r>
-        <w:rPr>
-          <w:rFonts w:ascii="Times New Roman" w:eastAsia="Times New Roman" w:hAnsi="Times New Roman"/>
-          <w:sz w:val="25"/>
-        </w:rPr>
-        <w:t>10. Bước 7 - Logistic Regression</w:t>
+        <w:t>10. Bước 7 - So sánh Logistic Regression và Random Forest</w:t>
       </w:r>
     </w:p>
     <w:p>
@@ -3277,10 +3257,7 @@
         <w:spacing w:after="80"/>
       </w:pPr>
       <w:r>
-        <w:rPr>
-          <w:rFonts w:eastAsia="Times New Roman"/>
-        </w:rPr>
-        <w:t>Target: At_Risk. Features: Attendance, Study Hours, Previous Grade, Sleep Hours, Socioeconomic,...</w:t>
+        <w:t>Target: At_Risk. Features: thông tin nền/bối cảnh môn học và VLE/assessment chỉ đến cutoff; cấm target, withdrawal tương lai và aggregate toàn khóa.</w:t>
       </w:r>
     </w:p>
     <w:p>
@@ -3288,10 +3265,7 @@
         <w:spacing w:after="80"/>
       </w:pPr>
       <w:r>
-        <w:rPr>
-          <w:rFonts w:eastAsia="Times New Roman"/>
-        </w:rPr>
-        <w:t>Pipeline: Clean Data -&gt; Select Features -&gt; Encode -&gt; Train/Test Split -&gt; Logistic Regression -&gt; Evaluate -&gt; Risk Probability.</w:t>
+        <w:t>Pipeline: Clean Raw -&gt; Feature theo Cutoff -&gt; Group Train/Validation/Test Split -&gt; Baseline -&gt; Logistic Regression + Random Forest -&gt; Compare -&gt; Threshold -&gt; Risk Probability.</w:t>
       </w:r>
     </w:p>
     <w:p>
@@ -3299,11 +3273,7 @@
         <w:spacing w:after="80"/>
       </w:pPr>
       <w:r>
-        <w:rPr>
-          <w:rFonts w:eastAsia="Times New Roman"/>
-          <w:b/>
-        </w:rPr>
-        <w:t>Output: student_id, actual_status, predicted_status, risk_probability.</w:t>
+        <w:t>Output: code_module, code_presentation, id_student, model_name, actual_status, predicted_status, risk_probability, split, cutoff, threshold và model_version.</w:t>
       </w:r>
     </w:p>
     <w:p>
@@ -5327,11 +5297,7 @@
         <w:spacing w:after="80"/>
       </w:pPr>
       <w:r>
-        <w:rPr>
-          <w:rFonts w:eastAsia="Times New Roman"/>
-          <w:b/>
-        </w:rPr>
-        <w:t>Bài toán -&gt; Dataset &gt;= 5.000 + &gt;= 3 bảng -&gt; Data Dictionary -&gt; Audit -&gt; Cleaning -&gt; Join/Merge -&gt; Feature Engineering -&gt; EDA -&gt; Interaction Analysis -&gt; 5-7 Main Insights -&gt; Risk Profile -&gt; Logistic Regression -&gt; Prediction -&gt; Tableau Dashboard -&gt; Storytelling -&gt; Report + Demo + Defense.</w:t>
+        <w:t>Bài toán -&gt; Dataset &gt;= 5.000 + &gt;= 3 bảng -&gt; Data Dictionary -&gt; Audit -&gt; Cleaning -&gt; Feature theo Cutoff -&gt; EDA -&gt; Interaction Analysis -&gt; 5-7 Main Insights -&gt; Risk Profile -&gt; Logistic Regression + Random Forest -&gt; Model Comparison -&gt; Prediction -&gt; Tableau Dashboard -&gt; Storytelling -&gt; Report + Demo + Defense.</w:t>
       </w:r>
     </w:p>
     <w:p>
@@ -5357,11 +5323,7 @@
         </w:rPr>
       </w:pPr>
       <w:r>
-        <w:rPr>
-          <w:rFonts w:eastAsia="Times New Roman"/>
-          <w:b/>
-        </w:rPr>
-        <w:t>TV1 Data - TV2 Analysis - TV3 Dashboard/Model; sử dụng Python + Tableau; Logistic Regression với target At_Risk; Dashboard 4 trang; trọng tâm phân tích là interaction + risk profile thay vì chỉ phân tích từng yếu tố riêng lẻ.</w:t>
+        <w:t>TV1 Data - TV2 Analysis - TV3 Dashboard/Model; sử dụng Python + Tableau; Logistic Regression bắt buộc và Random Forest đối chứng với target At_Risk; Dashboard 4 trang; trọng tâm là interaction + risk profile và so sánh mô hình công bằng.</w:t>
       </w:r>
     </w:p>
     <w:p>
@@ -5723,26 +5685,8 @@
         <w:spacing w:after="80"/>
       </w:pPr>
       <w:r>
-        <w:t xml:space="preserve">và dùng </w:t>
-      </w:r>
-      <w:r>
-        <w:rPr>
-          <w:b/>
-          <w:bCs/>
-        </w:rPr>
-        <w:t>Logistic Regression</w:t>
-      </w:r>
-      <w:r>
-        <w:t xml:space="preserve"> đúng rubric. OULAD cũng được UCI ghi nhận là phù hợp cho classification và regression. </w:t>
-      </w:r>
-      <w:hyperlink r:id="rId11" w:history="1">
-        <w:r>
-          <w:rPr>
-            <w:rStyle w:val="Hyperlink"/>
-          </w:rPr>
-          <w:t>UCI Archive</w:t>
-        </w:r>
-      </w:hyperlink>
+        <w:t>và dùng Logistic Regression đúng rubric, đồng thời so sánh Random Forest trên cùng dữ liệu/split. OULAD cũng được UCI ghi nhận là phù hợp cho classification và regression. UCI Archive</w:t>
+      </w:r>
     </w:p>
     <w:p>
       <w:pPr>
@@ -5867,7 +5811,7 @@
         <w:spacing w:after="80"/>
       </w:pPr>
       <w:r>
-        <w:t>Logistic Regression + Tableau</w:t>
+        <w:t>Logistic Regression + Random Forest + Tableau</w:t>
       </w:r>
     </w:p>
     <w:p>

</xml_diff>

<commit_message>
revert: remove unapproved two-model plan
</commit_message>
<xml_diff>
--- a/docs/source/TTDLTQ_script.docx
+++ b/docs/source/TTDLTQ_script.docx
@@ -195,7 +195,11 @@
         <w:spacing w:after="40" w:line="264" w:lineRule="auto"/>
       </w:pPr>
       <w:r>
-        <w:t>Xây dựng và so sánh Logistic Regression với Random Forest để dự đoán trạng thái At-Risk / Not-At-Risk; Logistic Regression vẫn là mô hình bắt buộc theo rubric.</w:t>
+        <w:rPr>
+          <w:rFonts w:eastAsia="Times New Roman"/>
+          <w:sz w:val="23"/>
+        </w:rPr>
+        <w:t>Xây dựng mô hình Logistic Regression để dự đoán trạng thái At-Risk / Not-At-Risk.</w:t>
       </w:r>
     </w:p>
     <w:p>
@@ -2094,7 +2098,11 @@
         <w:spacing w:after="40" w:line="264" w:lineRule="auto"/>
       </w:pPr>
       <w:r>
-        <w:t>scikit-learn để xây dựng Logistic Regression và Random Forest trên cùng dữ liệu/split.</w:t>
+        <w:rPr>
+          <w:rFonts w:eastAsia="Times New Roman"/>
+          <w:sz w:val="23"/>
+        </w:rPr>
+        <w:t>scikit-learn để xây dựng Logistic Regression.</w:t>
       </w:r>
     </w:p>
     <w:p>
@@ -2115,7 +2123,11 @@
         <w:spacing w:after="80"/>
       </w:pPr>
       <w:r>
-        <w:t>Mô hình chốt: Logistic Regression bắt buộc và Random Forest đối chứng. Target: At_Risk = 1, Not_At_Risk = 0.</w:t>
+        <w:rPr>
+          <w:rFonts w:eastAsia="Times New Roman"/>
+          <w:b/>
+        </w:rPr>
+        <w:t>Mô hình chốt: Logistic Regression. Target: At_Risk = 1, Not_At_Risk = 0.</w:t>
       </w:r>
     </w:p>
     <w:p>
@@ -2682,7 +2694,11 @@
         <w:spacing w:after="40" w:line="264" w:lineRule="auto"/>
       </w:pPr>
       <w:r>
-        <w:t>RQ6. Logistic Regression và Random Forest nhận diện At-Risk hiệu quả ra sao trên cùng dữ liệu dự báo sớm?</w:t>
+        <w:rPr>
+          <w:rFonts w:eastAsia="Times New Roman"/>
+          <w:sz w:val="23"/>
+        </w:rPr>
+        <w:t>RQ6. Có thể nhận diện sinh viên At-Risk bằng Logistic Regression không?</w:t>
       </w:r>
     </w:p>
     <w:p>
@@ -3237,7 +3253,11 @@
         <w:spacing w:before="100" w:after="80"/>
       </w:pPr>
       <w:r>
-        <w:t>10. Bước 7 - So sánh Logistic Regression và Random Forest</w:t>
+        <w:rPr>
+          <w:rFonts w:ascii="Times New Roman" w:eastAsia="Times New Roman" w:hAnsi="Times New Roman"/>
+          <w:sz w:val="25"/>
+        </w:rPr>
+        <w:t>10. Bước 7 - Logistic Regression</w:t>
       </w:r>
     </w:p>
     <w:p>
@@ -3257,7 +3277,10 @@
         <w:spacing w:after="80"/>
       </w:pPr>
       <w:r>
-        <w:t>Target: At_Risk. Features: thông tin nền/bối cảnh môn học và VLE/assessment chỉ đến cutoff; cấm target, withdrawal tương lai và aggregate toàn khóa.</w:t>
+        <w:rPr>
+          <w:rFonts w:eastAsia="Times New Roman"/>
+        </w:rPr>
+        <w:t>Target: At_Risk. Features: Attendance, Study Hours, Previous Grade, Sleep Hours, Socioeconomic,...</w:t>
       </w:r>
     </w:p>
     <w:p>
@@ -3265,7 +3288,10 @@
         <w:spacing w:after="80"/>
       </w:pPr>
       <w:r>
-        <w:t>Pipeline: Clean Raw -&gt; Feature theo Cutoff -&gt; Group Train/Validation/Test Split -&gt; Baseline -&gt; Logistic Regression + Random Forest -&gt; Compare -&gt; Threshold -&gt; Risk Probability.</w:t>
+        <w:rPr>
+          <w:rFonts w:eastAsia="Times New Roman"/>
+        </w:rPr>
+        <w:t>Pipeline: Clean Data -&gt; Select Features -&gt; Encode -&gt; Train/Test Split -&gt; Logistic Regression -&gt; Evaluate -&gt; Risk Probability.</w:t>
       </w:r>
     </w:p>
     <w:p>
@@ -3273,7 +3299,11 @@
         <w:spacing w:after="80"/>
       </w:pPr>
       <w:r>
-        <w:t>Output: code_module, code_presentation, id_student, model_name, actual_status, predicted_status, risk_probability, split, cutoff, threshold và model_version.</w:t>
+        <w:rPr>
+          <w:rFonts w:eastAsia="Times New Roman"/>
+          <w:b/>
+        </w:rPr>
+        <w:t>Output: student_id, actual_status, predicted_status, risk_probability.</w:t>
       </w:r>
     </w:p>
     <w:p>
@@ -5297,7 +5327,11 @@
         <w:spacing w:after="80"/>
       </w:pPr>
       <w:r>
-        <w:t>Bài toán -&gt; Dataset &gt;= 5.000 + &gt;= 3 bảng -&gt; Data Dictionary -&gt; Audit -&gt; Cleaning -&gt; Feature theo Cutoff -&gt; EDA -&gt; Interaction Analysis -&gt; 5-7 Main Insights -&gt; Risk Profile -&gt; Logistic Regression + Random Forest -&gt; Model Comparison -&gt; Prediction -&gt; Tableau Dashboard -&gt; Storytelling -&gt; Report + Demo + Defense.</w:t>
+        <w:rPr>
+          <w:rFonts w:eastAsia="Times New Roman"/>
+          <w:b/>
+        </w:rPr>
+        <w:t>Bài toán -&gt; Dataset &gt;= 5.000 + &gt;= 3 bảng -&gt; Data Dictionary -&gt; Audit -&gt; Cleaning -&gt; Join/Merge -&gt; Feature Engineering -&gt; EDA -&gt; Interaction Analysis -&gt; 5-7 Main Insights -&gt; Risk Profile -&gt; Logistic Regression -&gt; Prediction -&gt; Tableau Dashboard -&gt; Storytelling -&gt; Report + Demo + Defense.</w:t>
       </w:r>
     </w:p>
     <w:p>
@@ -5323,7 +5357,11 @@
         </w:rPr>
       </w:pPr>
       <w:r>
-        <w:t>TV1 Data - TV2 Analysis - TV3 Dashboard/Model; sử dụng Python + Tableau; Logistic Regression bắt buộc và Random Forest đối chứng với target At_Risk; Dashboard 4 trang; trọng tâm là interaction + risk profile và so sánh mô hình công bằng.</w:t>
+        <w:rPr>
+          <w:rFonts w:eastAsia="Times New Roman"/>
+          <w:b/>
+        </w:rPr>
+        <w:t>TV1 Data - TV2 Analysis - TV3 Dashboard/Model; sử dụng Python + Tableau; Logistic Regression với target At_Risk; Dashboard 4 trang; trọng tâm phân tích là interaction + risk profile thay vì chỉ phân tích từng yếu tố riêng lẻ.</w:t>
       </w:r>
     </w:p>
     <w:p>
@@ -5685,8 +5723,26 @@
         <w:spacing w:after="80"/>
       </w:pPr>
       <w:r>
-        <w:t>và dùng Logistic Regression đúng rubric, đồng thời so sánh Random Forest trên cùng dữ liệu/split. OULAD cũng được UCI ghi nhận là phù hợp cho classification và regression. UCI Archive</w:t>
-      </w:r>
+        <w:t xml:space="preserve">và dùng </w:t>
+      </w:r>
+      <w:r>
+        <w:rPr>
+          <w:b/>
+          <w:bCs/>
+        </w:rPr>
+        <w:t>Logistic Regression</w:t>
+      </w:r>
+      <w:r>
+        <w:t xml:space="preserve"> đúng rubric. OULAD cũng được UCI ghi nhận là phù hợp cho classification và regression. </w:t>
+      </w:r>
+      <w:hyperlink r:id="rId11" w:history="1">
+        <w:r>
+          <w:rPr>
+            <w:rStyle w:val="Hyperlink"/>
+          </w:rPr>
+          <w:t>UCI Archive</w:t>
+        </w:r>
+      </w:hyperlink>
     </w:p>
     <w:p>
       <w:pPr>
@@ -5811,7 +5867,7 @@
         <w:spacing w:after="80"/>
       </w:pPr>
       <w:r>
-        <w:t>Logistic Regression + Random Forest + Tableau</w:t>
+        <w:t>Logistic Regression + Tableau</w:t>
       </w:r>
     </w:p>
     <w:p>

</xml_diff>